<commit_message>
feat: rename xml building functions
</commit_message>
<xml_diff>
--- a/public/report/report-blueprint.docx
+++ b/public/report/report-blueprint.docx
@@ -328,12 +328,18 @@
     </w:p>
     <w:p>
       <w:r>
-        <w:t>{@hazard_title}</w:t>
-      </w:r>
-    </w:p>
-    <w:p>
-      <w:r>
-        <w:t>{@hazards_xml}</w:t>
+        <w:t>{@title}</w:t>
+      </w:r>
+    </w:p>
+    <w:p>
+      <w:r>
+        <w:t>{@</w:t>
+      </w:r>
+      <w:r>
+        <w:t>content</w:t>
+      </w:r>
+      <w:r>
+        <w:t>}</w:t>
       </w:r>
     </w:p>
     <w:p>
@@ -371,164 +377,56 @@
       </w:r>
     </w:p>
     <w:p>
-      <w:pPr>
-        <w:pStyle w:val="BodytextBGI"/>
-        <w:numPr>
-          <w:ilvl w:val="0"/>
-          <w:numId w:val="6"/>
-        </w:numPr>
+      <w:r>
+        <w:t>{#</w:t>
+      </w:r>
+      <w:r>
+        <w:t>machbarkeit</w:t>
+      </w:r>
+      <w:r>
+        <w:t>}</w:t>
+      </w:r>
+    </w:p>
+    <w:p>
+      <w:r>
+        <w:t>{@title}</w:t>
+      </w:r>
+    </w:p>
+    <w:p>
+      <w:r>
+        <w:t>{@</w:t>
+      </w:r>
+      <w:r>
+        <w:t>content</w:t>
+      </w:r>
+      <w:r>
+        <w:t>}</w:t>
+      </w:r>
+    </w:p>
+    <w:p>
+      <w:pPr>
         <w:rPr>
+          <w:rFonts w:ascii="Arthouse Owned Medium" w:hAnsi="Arthouse Owned Medium"/>
           <w:highlight w:val="red"/>
         </w:rPr>
       </w:pPr>
       <w:r>
-        <w:rPr>
-          <w:highlight w:val="red"/>
-        </w:rPr>
-        <w:t>Altlasten</w:t>
-      </w:r>
-    </w:p>
-    <w:p>
-      <w:pPr>
-        <w:pStyle w:val="BodytextBGI"/>
-        <w:numPr>
-          <w:ilvl w:val="1"/>
-          <w:numId w:val="6"/>
-        </w:numPr>
-      </w:pPr>
-      <w:r>
-        <w:t>Notiz: {</w:t>
+        <w:t>{/</w:t>
       </w:r>
       <w:proofErr w:type="spellStart"/>
       <w:r>
-        <w:t>notiz_text</w:t>
+        <w:t>machbarkeit</w:t>
       </w:r>
       <w:proofErr w:type="spellEnd"/>
       <w:r>
         <w:t>}</w:t>
       </w:r>
-    </w:p>
-    <w:p>
-      <w:pPr>
-        <w:pStyle w:val="BodytextBGI"/>
-        <w:numPr>
-          <w:ilvl w:val="0"/>
-          <w:numId w:val="6"/>
-        </w:numPr>
-        <w:rPr>
-          <w:highlight w:val="green"/>
-        </w:rPr>
-      </w:pPr>
-      <w:r>
-        <w:rPr>
-          <w:highlight w:val="green"/>
-        </w:rPr>
-        <w:t>Unterirdische Infrastrukturen</w:t>
-      </w:r>
-    </w:p>
-    <w:p>
-      <w:pPr>
-        <w:pStyle w:val="BodytextBGI"/>
-        <w:numPr>
-          <w:ilvl w:val="0"/>
-          <w:numId w:val="6"/>
-        </w:numPr>
-        <w:rPr>
-          <w:highlight w:val="green"/>
-        </w:rPr>
-      </w:pPr>
-      <w:r>
-        <w:rPr>
-          <w:highlight w:val="green"/>
-        </w:rPr>
-        <w:t>Altbaumbestand</w:t>
-      </w:r>
-    </w:p>
-    <w:p>
-      <w:pPr>
-        <w:pStyle w:val="BodytextBGI"/>
-        <w:numPr>
-          <w:ilvl w:val="0"/>
-          <w:numId w:val="6"/>
-        </w:numPr>
-        <w:rPr>
-          <w:highlight w:val="red"/>
-        </w:rPr>
-      </w:pPr>
-      <w:r>
-        <w:rPr>
-          <w:highlight w:val="red"/>
-        </w:rPr>
-        <w:t>Geologischer Untergrund</w:t>
-      </w:r>
-    </w:p>
-    <w:p>
-      <w:pPr>
-        <w:pStyle w:val="BodytextBGI"/>
-        <w:numPr>
-          <w:ilvl w:val="1"/>
-          <w:numId w:val="6"/>
-        </w:numPr>
-      </w:pPr>
-      <w:r>
-        <w:t>Notiz: {</w:t>
-      </w:r>
-      <w:proofErr w:type="spellStart"/>
-      <w:r>
-        <w:t>notiz_text</w:t>
-      </w:r>
-      <w:proofErr w:type="spellEnd"/>
-      <w:r>
-        <w:t>}</w:t>
-      </w:r>
-    </w:p>
-    <w:p>
-      <w:pPr>
-        <w:pStyle w:val="BodytextBGI"/>
-        <w:numPr>
-          <w:ilvl w:val="0"/>
-          <w:numId w:val="6"/>
-        </w:numPr>
-        <w:rPr>
-          <w:highlight w:val="green"/>
-        </w:rPr>
-      </w:pPr>
-      <w:r>
-        <w:rPr>
-          <w:highlight w:val="green"/>
-        </w:rPr>
-        <w:t>Denkmalschutz</w:t>
-      </w:r>
-    </w:p>
-    <w:p>
-      <w:pPr>
-        <w:pStyle w:val="BodytextBGI"/>
-        <w:ind w:left="720"/>
-        <w:rPr>
-          <w:highlight w:val="green"/>
-        </w:rPr>
-      </w:pPr>
-    </w:p>
-    <w:p>
-      <w:pPr>
-        <w:rPr>
-          <w:highlight w:val="red"/>
-        </w:rPr>
-      </w:pPr>
       <w:r>
         <w:rPr>
           <w:highlight w:val="red"/>
         </w:rPr>
         <w:br w:type="page"/>
       </w:r>
-    </w:p>
-    <w:p>
-      <w:pPr>
-        <w:pStyle w:val="berschrift1BGI"/>
-        <w:rPr>
-          <w:rFonts w:ascii="Arthouse Owned Medium" w:hAnsi="Arthouse Owned Medium"/>
-        </w:rPr>
-      </w:pPr>
       <w:r>
         <w:lastRenderedPageBreak/>
         <w:t>Geplante Maßnahmen</w:t>
@@ -628,7 +526,15 @@
               <w:pStyle w:val="BodytextBGI"/>
             </w:pPr>
             <w:r>
-              <w:t>400</w:t>
+              <w:t>{</w:t>
+            </w:r>
+            <w:proofErr w:type="spellStart"/>
+            <w:r>
+              <w:t>dachbegruenung</w:t>
+            </w:r>
+            <w:proofErr w:type="spellEnd"/>
+            <w:r>
+              <w:t>}</w:t>
             </w:r>
           </w:p>
         </w:tc>
@@ -669,10 +575,7 @@
               <w:pStyle w:val="BodytextBGI"/>
             </w:pPr>
             <w:r>
-              <w:t>3</w:t>
-            </w:r>
-            <w:r>
-              <w:t>00</w:t>
+              <w:t>-</w:t>
             </w:r>
           </w:p>
         </w:tc>
@@ -713,7 +616,7 @@
               <w:pStyle w:val="BodytextBGI"/>
             </w:pPr>
             <w:r>
-              <w:t>1800</w:t>
+              <w:t>-</w:t>
             </w:r>
           </w:p>
         </w:tc>
@@ -754,7 +657,7 @@
               <w:pStyle w:val="BodytextBGI"/>
             </w:pPr>
             <w:r>
-              <w:t>2400</w:t>
+              <w:t>-</w:t>
             </w:r>
           </w:p>
         </w:tc>
@@ -795,7 +698,7 @@
               <w:pStyle w:val="BodytextBGI"/>
             </w:pPr>
             <w:r>
-              <w:t>1000</w:t>
+              <w:t>-</w:t>
             </w:r>
           </w:p>
         </w:tc>
@@ -836,7 +739,7 @@
               <w:pStyle w:val="BodytextBGI"/>
             </w:pPr>
             <w:r>
-              <w:t>120</w:t>
+              <w:t>-</w:t>
             </w:r>
           </w:p>
         </w:tc>
@@ -849,7 +752,7 @@
               <w:pStyle w:val="BodytextBGI"/>
             </w:pPr>
             <w:r>
-              <w:t>400</w:t>
+              <w:t>-</w:t>
             </w:r>
           </w:p>
         </w:tc>
@@ -877,7 +780,7 @@
               <w:pStyle w:val="BodytextBGI"/>
             </w:pPr>
             <w:r>
-              <w:t>60</w:t>
+              <w:t>-</w:t>
             </w:r>
           </w:p>
         </w:tc>
@@ -890,7 +793,7 @@
               <w:pStyle w:val="BodytextBGI"/>
             </w:pPr>
             <w:r>
-              <w:t>300</w:t>
+              <w:t>-</w:t>
             </w:r>
           </w:p>
         </w:tc>
@@ -931,7 +834,7 @@
               <w:pStyle w:val="BodytextBGI"/>
             </w:pPr>
             <w:r>
-              <w:t>600</w:t>
+              <w:t>-</w:t>
             </w:r>
           </w:p>
         </w:tc>
@@ -959,7 +862,7 @@
               <w:pStyle w:val="BodytextBGI"/>
             </w:pPr>
             <w:r>
-              <w:t>20</w:t>
+              <w:t>-</w:t>
             </w:r>
           </w:p>
         </w:tc>
@@ -972,7 +875,7 @@
               <w:pStyle w:val="BodytextBGI"/>
             </w:pPr>
             <w:r>
-              <w:t>155</w:t>
+              <w:t>-</w:t>
             </w:r>
           </w:p>
         </w:tc>
@@ -1000,7 +903,7 @@
               <w:pStyle w:val="BodytextBGI"/>
             </w:pPr>
             <w:r>
-              <w:t>60</w:t>
+              <w:t>-</w:t>
             </w:r>
           </w:p>
         </w:tc>
@@ -1127,7 +1030,7 @@
               <w:pStyle w:val="BodytextBGI"/>
             </w:pPr>
             <w:r>
-              <w:t>35</w:t>
+              <w:t>-</w:t>
             </w:r>
           </w:p>
         </w:tc>
@@ -1140,7 +1043,7 @@
               <w:pStyle w:val="BodytextBGI"/>
             </w:pPr>
             <w:r>
-              <w:t>12</w:t>
+              <w:t>-</w:t>
             </w:r>
           </w:p>
         </w:tc>
@@ -1168,7 +1071,7 @@
               <w:pStyle w:val="BodytextBGI"/>
             </w:pPr>
             <w:r>
-              <w:t>400</w:t>
+              <w:t>-</w:t>
             </w:r>
           </w:p>
         </w:tc>
@@ -1181,7 +1084,7 @@
               <w:pStyle w:val="BodytextBGI"/>
             </w:pPr>
             <w:r>
-              <w:t>200</w:t>
+              <w:t>-</w:t>
             </w:r>
           </w:p>
         </w:tc>
@@ -1209,7 +1112,7 @@
               <w:pStyle w:val="BodytextBGI"/>
             </w:pPr>
             <w:r>
-              <w:t>56</w:t>
+              <w:t>-</w:t>
             </w:r>
           </w:p>
         </w:tc>
@@ -1222,7 +1125,7 @@
               <w:pStyle w:val="BodytextBGI"/>
             </w:pPr>
             <w:r>
-              <w:t>65</w:t>
+              <w:t>-</w:t>
             </w:r>
           </w:p>
         </w:tc>
@@ -1248,9 +1151,12 @@
           <w:p>
             <w:pPr>
               <w:pStyle w:val="BodytextBGI"/>
-            </w:pPr>
-            <w:r>
-              <w:t>123</w:t>
+              <w:tabs>
+                <w:tab w:val="center" w:pos="1451"/>
+              </w:tabs>
+            </w:pPr>
+            <w:r>
+              <w:t>-</w:t>
             </w:r>
           </w:p>
         </w:tc>
@@ -1263,7 +1169,7 @@
               <w:pStyle w:val="BodytextBGI"/>
             </w:pPr>
             <w:r>
-              <w:t>321</w:t>
+              <w:t>-</w:t>
             </w:r>
           </w:p>
         </w:tc>
@@ -1388,7 +1294,7 @@
               <w:pStyle w:val="BodytextBGI"/>
             </w:pPr>
             <w:r>
-              <w:t>10,5</w:t>
+              <w:t>-</w:t>
             </w:r>
           </w:p>
         </w:tc>
@@ -1419,7 +1325,7 @@
               <w:pStyle w:val="BodytextBGI"/>
             </w:pPr>
             <w:r>
-              <w:t>35</w:t>
+              <w:t>-</w:t>
             </w:r>
           </w:p>
         </w:tc>
@@ -1432,7 +1338,7 @@
               <w:pStyle w:val="BodytextBGI"/>
             </w:pPr>
             <w:r>
-              <w:t>12</w:t>
+              <w:t>-</w:t>
             </w:r>
           </w:p>
         </w:tc>
@@ -1463,7 +1369,7 @@
               <w:pStyle w:val="BodytextBGI"/>
             </w:pPr>
             <w:r>
-              <w:t>400</w:t>
+              <w:t>-</w:t>
             </w:r>
           </w:p>
         </w:tc>
@@ -1476,7 +1382,7 @@
               <w:pStyle w:val="BodytextBGI"/>
             </w:pPr>
             <w:r>
-              <w:t>200</w:t>
+              <w:t>-</w:t>
             </w:r>
           </w:p>
         </w:tc>
@@ -1516,7 +1422,7 @@
               <w:pStyle w:val="BodytextBGI"/>
             </w:pPr>
             <w:r>
-              <w:t>56</w:t>
+              <w:t>-</w:t>
             </w:r>
           </w:p>
         </w:tc>
@@ -1529,7 +1435,7 @@
               <w:pStyle w:val="BodytextBGI"/>
             </w:pPr>
             <w:r>
-              <w:t>65</w:t>
+              <w:t>-</w:t>
             </w:r>
           </w:p>
         </w:tc>

</xml_diff>